<commit_message>
release: bump version to 2.3.3 and refresh docs/models
</commit_message>
<xml_diff>
--- a/GeoClaw-OpenAI_工程说明书.docx
+++ b/GeoClaw-OpenAI_工程说明书.docx
@@ -15,7 +15,7 @@
         <w:pStyle w:val="Subtitle"/>
       </w:pPr>
       <w:r>
-        <w:t xml:space="preserve">文档版本：v1.0（文档） | 工程实现基线：v2.3.0</w:t>
+        <w:t xml:space="preserve">文档版本：v1.0（文档） | 工程实现基线：v2.3.3</w:t>
       </w:r>
     </w:p>
     <w:p>
@@ -87,7 +87,7 @@
     </w:p>
     <w:p>
       <w:r>
-        <w:t xml:space="preserve">当前代码版本为 2.3.0，已包含多模型 AI、自动上下文压缩、Memory 检索归档、安全输出机制等新增能力。</w:t>
+        <w:t xml:space="preserve">当前代码版本为 2.3.3，已包含多模型 AI、自动上下文压缩、Memory 检索归档、安全输出机制等新增能力。</w:t>
       </w:r>
     </w:p>
     <w:p>

</xml_diff>

<commit_message>
release: v2.4.0 add soul/user profile layers and module integration
</commit_message>
<xml_diff>
--- a/GeoClaw-OpenAI_工程说明书.docx
+++ b/GeoClaw-OpenAI_工程说明书.docx
@@ -20,7 +20,7 @@
     </w:p>
     <w:p>
       <w:r>
-        <w:t xml:space="preserve">版本：v2.3.4</w:t>
+        <w:t xml:space="preserve">版本：v2.4.0</w:t>
       </w:r>
     </w:p>
     <w:p>
@@ -53,7 +53,7 @@
     </w:p>
     <w:p>
       <w:r>
-        <w:t xml:space="preserve">v2.3.4 重点增强了商场选址 Skill 案例、安全门禁与 Skill 编写规范，提升可维护性与团队协作安全性。</w:t>
+        <w:t xml:space="preserve">v2.4.0 重点引入 Soul/User 双层个性化机制，增强系统边界约束与用户长期偏好驱动能力。</w:t>
       </w:r>
     </w:p>
     <w:p>
@@ -71,7 +71,7 @@
     </w:p>
     <w:p>
       <w:r>
-        <w:t xml:space="preserve">版本：2.3.4</w:t>
+        <w:t xml:space="preserve">版本：2.4.0</w:t>
       </w:r>
     </w:p>
     <w:p>
@@ -119,7 +119,12 @@
     </w:p>
     <w:p>
       <w:r>
-        <w:t xml:space="preserve">- src/geoclaw_qgis/: CLI、analysis、providers、skills、memory、security。</w:t>
+        <w:t xml:space="preserve">- src/geoclaw_qgis/: CLI、analysis、providers、skills、memory、profile、security。</w:t>
+      </w:r>
+    </w:p>
+    <w:p>
+      <w:r>
+        <w:t xml:space="preserve">- soul.md / user.md: 系统层与用户层长期配置文档。</w:t>
       </w:r>
     </w:p>
     <w:p>
@@ -157,45 +162,50 @@
     </w:p>
     <w:p>
       <w:r>
-        <w:t xml:space="preserve">4.6 Skill 扩展：支持 LLM 技能与 QGIS 技能双路径，并提供注册前安全评估。</w:t>
-      </w:r>
-    </w:p>
-    <w:p>
-      <w:r>
-        <w:t xml:space="preserve">4.7 Memory 体系：短期记录、长期复盘、归档与向量检索，支持任务经验复用。</w:t>
-      </w:r>
-    </w:p>
-    <w:p>
-      <w:r>
-        <w:t xml:space="preserve">4.8 轨迹网络：融合 Track-Intel 思路，输出 OD 边、节点、行程与网络摘要。</w:t>
-      </w:r>
-    </w:p>
-    <w:p>
-      <w:pPr>
-        <w:pStyle w:val="Heading1"/>
-      </w:pPr>
-      <w:r>
-        <w:t xml:space="preserve">5. 2.3.4 版本新增重点</w:t>
-      </w:r>
-    </w:p>
-    <w:p>
-      <w:r>
-        <w:t xml:space="preserve">5.1 新增商场选址 Skill 双写法案例：mall_site_selection_llm 与 mall_site_selection_qgis。</w:t>
-      </w:r>
-    </w:p>
-    <w:p>
-      <w:r>
-        <w:t xml:space="preserve">5.2 新增 Skill 安全门禁：skill-registry assess/register，high 风险默认阻断。</w:t>
-      </w:r>
-    </w:p>
-    <w:p>
-      <w:r>
-        <w:t xml:space="preserve">5.3 新增 Skill 编写规范文档，明确字段要求、行为边界、评审清单与测试要求。</w:t>
-      </w:r>
-    </w:p>
-    <w:p>
-      <w:r>
-        <w:t xml:space="preserve">5.4 README 与文档同步补充简要命令示例，便于新成员快速上手。</w:t>
+        <w:t xml:space="preserve">4.6 Soul/User 分层：soul.md 定义系统边界，user.md 定义用户长期偏好，统一解析后供 planner/router/report/memory 复用。</w:t>
+      </w:r>
+    </w:p>
+    <w:p>
+      <w:r>
+        <w:t xml:space="preserve">4.7 Skill 扩展：支持 LLM 技能与 QGIS 技能双路径，并提供注册前安全评估。</w:t>
+      </w:r>
+    </w:p>
+    <w:p>
+      <w:r>
+        <w:t xml:space="preserve">4.8 Memory 体系：短期记录、长期复盘、归档与向量检索，支持任务经验复用。</w:t>
+      </w:r>
+    </w:p>
+    <w:p>
+      <w:r>
+        <w:t xml:space="preserve">4.9 轨迹网络：融合 Track-Intel 思路，输出 OD 边、节点、行程与网络摘要。</w:t>
+      </w:r>
+    </w:p>
+    <w:p>
+      <w:pPr>
+        <w:pStyle w:val="Heading1"/>
+      </w:pPr>
+      <w:r>
+        <w:t xml:space="preserve">5. 2.4.0 版本新增重点</w:t>
+      </w:r>
+    </w:p>
+    <w:p>
+      <w:r>
+        <w:t xml:space="preserve">5.1 新增 soul.md + user.md 双层长期配置，并自动在会话初始化加载。</w:t>
+      </w:r>
+    </w:p>
+    <w:p>
+      <w:r>
+        <w:t xml:space="preserve">5.2 planner/tool-router/report/memory 四模块接入结构化 profile 对象。</w:t>
+      </w:r>
+    </w:p>
+    <w:p>
+      <w:r>
+        <w:t xml:space="preserve">5.3 新增 profile CLI：profile init/show，便于用户配置与排障。</w:t>
+      </w:r>
+    </w:p>
+    <w:p>
+      <w:r>
+        <w:t xml:space="preserve">5.4 文档与工程说明书同步升级到 v2.4.0。</w:t>
       </w:r>
     </w:p>
     <w:p>
@@ -218,22 +228,27 @@
     </w:p>
     <w:p>
       <w:r>
-        <w:t xml:space="preserve">6.3 标准分析：geoclaw-openai run --case native_cases --city "武汉市"。</w:t>
-      </w:r>
-    </w:p>
-    <w:p>
-      <w:r>
-        <w:t xml:space="preserve">6.4 Skill 安全评估：geoclaw-openai skill-registry assess --spec-file &lt;skill.json&gt;。</w:t>
-      </w:r>
-    </w:p>
-    <w:p>
-      <w:r>
-        <w:t xml:space="preserve">6.5 通过评估后注册：geoclaw-openai skill-registry register --spec-file &lt;skill.json&gt; --confirm。</w:t>
-      </w:r>
-    </w:p>
-    <w:p>
-      <w:r>
-        <w:t xml:space="preserve">6.6 回归测试：python3 -m unittest discover -s src/geoclaw_qgis/tests。</w:t>
+        <w:t xml:space="preserve">6.3 初始化 profile：geoclaw-openai profile init &amp;&amp; geoclaw-openai profile show。</w:t>
+      </w:r>
+    </w:p>
+    <w:p>
+      <w:r>
+        <w:t xml:space="preserve">6.4 标准分析：geoclaw-openai run --case native_cases --city "武汉市"。</w:t>
+      </w:r>
+    </w:p>
+    <w:p>
+      <w:r>
+        <w:t xml:space="preserve">6.5 Skill 安全评估：geoclaw-openai skill-registry assess --spec-file &lt;skill.json&gt;。</w:t>
+      </w:r>
+    </w:p>
+    <w:p>
+      <w:r>
+        <w:t xml:space="preserve">6.6 通过评估后注册：geoclaw-openai skill-registry register --spec-file &lt;skill.json&gt; --confirm。</w:t>
+      </w:r>
+    </w:p>
+    <w:p>
+      <w:r>
+        <w:t xml:space="preserve">6.7 回归测试：python3 -m unittest discover -s src/geoclaw_qgis/tests。</w:t>
       </w:r>
     </w:p>
     <w:p>
@@ -317,7 +332,7 @@
     </w:p>
     <w:p>
       <w:r>
-        <w:t xml:space="preserve">当前版本：v2.3.4</w:t>
+        <w:t xml:space="preserve">当前版本：v2.4.0</w:t>
       </w:r>
     </w:p>
     <w:p>

</xml_diff>

<commit_message>
docs: refresh README and engineering manual after full v2.4.0 verification
</commit_message>
<xml_diff>
--- a/GeoClaw-OpenAI_工程说明书.docx
+++ b/GeoClaw-OpenAI_工程说明书.docx
@@ -333,6 +333,11 @@
     <w:p>
       <w:r>
         <w:t xml:space="preserve">当前版本：v2.4.0</w:t>
+      </w:r>
+    </w:p>
+    <w:p>
+      <w:r>
+        <w:t xml:space="preserve">测试状态：单元测试与 day-run 全链路回归通过。</w:t>
       </w:r>
     </w:p>
     <w:p>

</xml_diff>

<commit_message>
release: v3.0.0 with SRE e2e NL reporting
</commit_message>
<xml_diff>
--- a/GeoClaw-OpenAI_工程说明书.docx
+++ b/GeoClaw-OpenAI_工程说明书.docx
@@ -20,7 +20,7 @@
     </w:p>
     <w:p>
       <w:r>
-        <w:t xml:space="preserve">版本：v2.4.0</w:t>
+        <w:t xml:space="preserve">版本：v3.0.0</w:t>
       </w:r>
     </w:p>
     <w:p>
@@ -53,7 +53,7 @@
     </w:p>
     <w:p>
       <w:r>
-        <w:t xml:space="preserve">v2.4.0 重点引入 Soul/User 双层个性化机制，增强系统边界约束与用户长期偏好驱动能力。</w:t>
+        <w:t xml:space="preserve">v3.0.0 形成 SRE+NL+Skill+Memory 的稳定闭环，并支持端到端询问与报告输出。</w:t>
       </w:r>
     </w:p>
     <w:p>
@@ -71,7 +71,7 @@
     </w:p>
     <w:p>
       <w:r>
-        <w:t xml:space="preserve">版本：2.4.0</w:t>
+        <w:t xml:space="preserve">版本：3.0.0</w:t>
       </w:r>
     </w:p>
     <w:p>
@@ -162,6 +162,11 @@
     </w:p>
     <w:p>
       <w:r>
+        <w:t xml:space="preserve">4.5.1 端到端报告：NL 在启用 SRE 时可直接输出标准化推理报告（受输出目录安全策略约束）。</w:t>
+      </w:r>
+    </w:p>
+    <w:p>
+      <w:r>
         <w:t xml:space="preserve">4.6 Soul/User 分层：soul.md 定义系统边界，user.md 定义用户长期偏好，统一解析后供 planner/router/report/memory 复用。</w:t>
       </w:r>
     </w:p>
@@ -185,27 +190,27 @@
         <w:pStyle w:val="Heading1"/>
       </w:pPr>
       <w:r>
-        <w:t xml:space="preserve">5. 2.4.0 版本新增重点</w:t>
-      </w:r>
-    </w:p>
-    <w:p>
-      <w:r>
-        <w:t xml:space="preserve">5.1 新增 soul.md + user.md 双层长期配置，并自动在会话初始化加载。</w:t>
-      </w:r>
-    </w:p>
-    <w:p>
-      <w:r>
-        <w:t xml:space="preserve">5.2 planner/tool-router/report/memory 四模块接入结构化 profile 对象。</w:t>
-      </w:r>
-    </w:p>
-    <w:p>
-      <w:r>
-        <w:t xml:space="preserve">5.3 新增 profile CLI：profile init/show，便于用户配置与排障。</w:t>
-      </w:r>
-    </w:p>
-    <w:p>
-      <w:r>
-        <w:t xml:space="preserve">5.4 文档与工程说明书同步升级到 v2.4.0。</w:t>
+        <w:t xml:space="preserve">5. 3.0.0 版本新增重点</w:t>
+      </w:r>
+    </w:p>
+    <w:p>
+      <w:r>
+        <w:t xml:space="preserve">5.1 Milestone A-F 收口：SRE 配置化、路由安全、高级推理、外部 reasoner 校验重试完成。</w:t>
+      </w:r>
+    </w:p>
+    <w:p>
+      <w:r>
+        <w:t xml:space="preserve">5.2 day-run 扩展为 11 步回归矩阵，覆盖 run/skill/reasoning/nl(use-sre)/memory。</w:t>
+      </w:r>
+    </w:p>
+    <w:p>
+      <w:r>
+        <w:t xml:space="preserve">5.3 新增 NL 端到端报告输出参数：--sre-report-out / --sre-print-report。</w:t>
+      </w:r>
+    </w:p>
+    <w:p>
+      <w:r>
+        <w:t xml:space="preserve">5.4 版本与文档体系升级到 v3.0.0。</w:t>
       </w:r>
     </w:p>
     <w:p>
@@ -238,17 +243,22 @@
     </w:p>
     <w:p>
       <w:r>
-        <w:t xml:space="preserve">6.5 Skill 安全评估：geoclaw-openai skill-registry assess --spec-file &lt;skill.json&gt;。</w:t>
-      </w:r>
-    </w:p>
-    <w:p>
-      <w:r>
-        <w:t xml:space="preserve">6.6 通过评估后注册：geoclaw-openai skill-registry register --spec-file &lt;skill.json&gt; --confirm。</w:t>
-      </w:r>
-    </w:p>
-    <w:p>
-      <w:r>
-        <w:t xml:space="preserve">6.7 回归测试：python3 -m unittest discover -s src/geoclaw_qgis/tests。</w:t>
+        <w:t xml:space="preserve">6.5 端到端询问+报告：geoclaw-openai nl "商场选址分析" --use-sre --sre-report-out data/outputs/reasoning/nl_report.md。</w:t>
+      </w:r>
+    </w:p>
+    <w:p>
+      <w:r>
+        <w:t xml:space="preserve">6.6 Skill 安全评估：geoclaw-openai skill-registry assess --spec-file &lt;skill.json&gt;。</w:t>
+      </w:r>
+    </w:p>
+    <w:p>
+      <w:r>
+        <w:t xml:space="preserve">6.7 通过评估后注册：geoclaw-openai skill-registry register --spec-file &lt;skill.json&gt; --confirm。</w:t>
+      </w:r>
+    </w:p>
+    <w:p>
+      <w:r>
+        <w:t xml:space="preserve">6.8 回归测试：python3 -m unittest discover -s src/geoclaw_qgis/tests。</w:t>
       </w:r>
     </w:p>
     <w:p>
@@ -332,7 +342,7 @@
     </w:p>
     <w:p>
       <w:r>
-        <w:t xml:space="preserve">当前版本：v2.4.0</w:t>
+        <w:t xml:space="preserve">当前版本：v3.0.0</w:t>
       </w:r>
     </w:p>
     <w:p>

</xml_diff>

<commit_message>
fix: harden NL route constraints and refresh full test/docs workflow
</commit_message>
<xml_diff>
--- a/GeoClaw-OpenAI_工程说明书.docx
+++ b/GeoClaw-OpenAI_工程说明书.docx
@@ -210,7 +210,22 @@
     </w:p>
     <w:p>
       <w:r>
-        <w:t xml:space="preserve">5.4 版本与文档体系升级到 v3.0.0。</w:t>
+        <w:t xml:space="preserve">5.4 新增复杂 NL 端到端回归套件：scripts/e2e_complex_nl_suite.sh（4 场景）。</w:t>
+      </w:r>
+    </w:p>
+    <w:p>
+      <w:r>
+        <w:t xml:space="preserve">5.5 NL 通用参数保留机制：run/network/operator 显式参数在 SRE 路由后仍被保留。</w:t>
+      </w:r>
+    </w:p>
+    <w:p>
+      <w:r>
+        <w:t xml:space="preserve">5.6 data 目录不再忽略，支持新用户直接复现实验样例。</w:t>
+      </w:r>
+    </w:p>
+    <w:p>
+      <w:r>
+        <w:t xml:space="preserve">5.7 版本与文档体系升级到 v3.0.0。</w:t>
       </w:r>
     </w:p>
     <w:p>
@@ -262,6 +277,11 @@
       </w:r>
     </w:p>
     <w:p>
+      <w:r>
+        <w:t xml:space="preserve">6.9 复杂端到端测试：bash scripts/e2e_complex_nl_suite.sh。</w:t>
+      </w:r>
+    </w:p>
+    <w:p>
       <w:pPr>
         <w:pStyle w:val="Heading1"/>
       </w:pPr>
@@ -347,7 +367,7 @@
     </w:p>
     <w:p>
       <w:r>
-        <w:t xml:space="preserve">测试状态：单元测试与 day-run 全链路回归通过。</w:t>
+        <w:t xml:space="preserve">测试状态：单元测试、day-run、复杂 NL 端到端回归通过。</w:t>
       </w:r>
     </w:p>
     <w:p>

</xml_diff>

<commit_message>
feat: add ollama + profile evolve with soul safety lock
</commit_message>
<xml_diff>
--- a/GeoClaw-OpenAI_工程说明书.docx
+++ b/GeoClaw-OpenAI_工程说明书.docx
@@ -20,7 +20,7 @@
     </w:p>
     <w:p>
       <w:r>
-        <w:t xml:space="preserve">版本：v3.0.0</w:t>
+        <w:t xml:space="preserve">版本：v3.1.0</w:t>
       </w:r>
     </w:p>
     <w:p>
@@ -53,7 +53,7 @@
     </w:p>
     <w:p>
       <w:r>
-        <w:t xml:space="preserve">v3.0.0 形成 SRE+NL+Skill+Memory 的稳定闭环，并支持端到端询问与报告输出。</w:t>
+        <w:t xml:space="preserve">v3.1.0 在 SRE+NL+Skill+Memory 稳定闭环基础上，新增本地大模型与 profile 对话演化机制。</w:t>
       </w:r>
     </w:p>
     <w:p>
@@ -71,7 +71,7 @@
     </w:p>
     <w:p>
       <w:r>
-        <w:t xml:space="preserve">版本：3.0.0</w:t>
+        <w:t xml:space="preserve">版本：3.1.0</w:t>
       </w:r>
     </w:p>
     <w:p>
@@ -190,42 +190,42 @@
         <w:pStyle w:val="Heading1"/>
       </w:pPr>
       <w:r>
-        <w:t xml:space="preserve">5. 3.0.0 版本新增重点</w:t>
-      </w:r>
-    </w:p>
-    <w:p>
-      <w:r>
-        <w:t xml:space="preserve">5.1 Milestone A-F 收口：SRE 配置化、路由安全、高级推理、外部 reasoner 校验重试完成。</w:t>
-      </w:r>
-    </w:p>
-    <w:p>
-      <w:r>
-        <w:t xml:space="preserve">5.2 day-run 扩展为 11 步回归矩阵，覆盖 run/skill/reasoning/nl(use-sre)/memory。</w:t>
-      </w:r>
-    </w:p>
-    <w:p>
-      <w:r>
-        <w:t xml:space="preserve">5.3 新增 NL 端到端报告输出参数：--sre-report-out / --sre-print-report。</w:t>
-      </w:r>
-    </w:p>
-    <w:p>
-      <w:r>
-        <w:t xml:space="preserve">5.4 新增复杂 NL 端到端回归套件：scripts/e2e_complex_nl_suite.sh（4 场景）。</w:t>
-      </w:r>
-    </w:p>
-    <w:p>
-      <w:r>
-        <w:t xml:space="preserve">5.5 NL 通用参数保留机制：run/network/operator 显式参数在 SRE 路由后仍被保留。</w:t>
-      </w:r>
-    </w:p>
-    <w:p>
-      <w:r>
-        <w:t xml:space="preserve">5.6 data 目录不再忽略，支持新用户直接复现实验样例。</w:t>
-      </w:r>
-    </w:p>
-    <w:p>
-      <w:r>
-        <w:t xml:space="preserve">5.7 版本与文档体系升级到 v3.0.0。</w:t>
+        <w:t xml:space="preserve">5. 3.1.0 版本新增重点</w:t>
+      </w:r>
+    </w:p>
+    <w:p>
+      <w:r>
+        <w:t xml:space="preserve">5.1 新增 Ollama 本地大模型 provider，并接入 onboard/config set 全链路。</w:t>
+      </w:r>
+    </w:p>
+    <w:p>
+      <w:r>
+        <w:t xml:space="preserve">5.2 新增 profile evolve：支持根据对话摘要更新 user.md/soul.md 覆盖层。</w:t>
+      </w:r>
+    </w:p>
+    <w:p>
+      <w:r>
+        <w:t xml:space="preserve">5.3 soul 安全边界字段锁定：重要安全与执行约束不可通过对话改写。</w:t>
+      </w:r>
+    </w:p>
+    <w:p>
+      <w:r>
+        <w:t xml:space="preserve">5.4 新增 NL-&gt;profile 路由能力：自然语言可触发 profile 演化命令。</w:t>
+      </w:r>
+    </w:p>
+    <w:p>
+      <w:r>
+        <w:t xml:space="preserve">5.5 day-run 与单元测试矩阵扩展，覆盖 profile evolve 与 provider 兼容性。</w:t>
+      </w:r>
+    </w:p>
+    <w:p>
+      <w:r>
+        <w:t xml:space="preserve">5.6 data 目录持续跟踪，支持新用户直接复现实验样例。</w:t>
+      </w:r>
+    </w:p>
+    <w:p>
+      <w:r>
+        <w:t xml:space="preserve">5.7 版本与文档体系升级到 v3.1.0。</w:t>
       </w:r>
     </w:p>
     <w:p>
@@ -253,32 +253,37 @@
     </w:p>
     <w:p>
       <w:r>
-        <w:t xml:space="preserve">6.4 标准分析：geoclaw-openai run --case native_cases --city "武汉市"。</w:t>
-      </w:r>
-    </w:p>
-    <w:p>
-      <w:r>
-        <w:t xml:space="preserve">6.5 端到端询问+报告：geoclaw-openai nl "商场选址分析" --use-sre --sre-report-out data/outputs/reasoning/nl_report.md。</w:t>
-      </w:r>
-    </w:p>
-    <w:p>
-      <w:r>
-        <w:t xml:space="preserve">6.6 Skill 安全评估：geoclaw-openai skill-registry assess --spec-file &lt;skill.json&gt;。</w:t>
-      </w:r>
-    </w:p>
-    <w:p>
-      <w:r>
-        <w:t xml:space="preserve">6.7 通过评估后注册：geoclaw-openai skill-registry register --spec-file &lt;skill.json&gt; --confirm。</w:t>
-      </w:r>
-    </w:p>
-    <w:p>
-      <w:r>
-        <w:t xml:space="preserve">6.8 回归测试：python3 -m unittest discover -s src/geoclaw_qgis/tests。</w:t>
-      </w:r>
-    </w:p>
-    <w:p>
-      <w:r>
-        <w:t xml:space="preserve">6.9 复杂端到端测试：bash scripts/e2e_complex_nl_suite.sh。</w:t>
+        <w:t xml:space="preserve">6.4 对话演化 profile：geoclaw-openai profile evolve --target user --summary "..." --set preferred_language=Chinese。</w:t>
+      </w:r>
+    </w:p>
+    <w:p>
+      <w:r>
+        <w:t xml:space="preserve">6.5 标准分析：geoclaw-openai run --case native_cases --city "武汉市"。</w:t>
+      </w:r>
+    </w:p>
+    <w:p>
+      <w:r>
+        <w:t xml:space="preserve">6.6 端到端询问+报告：geoclaw-openai nl "商场选址分析" --use-sre --sre-report-out data/outputs/reasoning/nl_report.md。</w:t>
+      </w:r>
+    </w:p>
+    <w:p>
+      <w:r>
+        <w:t xml:space="preserve">6.7 Skill 安全评估：geoclaw-openai skill-registry assess --spec-file &lt;skill.json&gt;。</w:t>
+      </w:r>
+    </w:p>
+    <w:p>
+      <w:r>
+        <w:t xml:space="preserve">6.8 通过评估后注册：geoclaw-openai skill-registry register --spec-file &lt;skill.json&gt; --confirm。</w:t>
+      </w:r>
+    </w:p>
+    <w:p>
+      <w:r>
+        <w:t xml:space="preserve">6.9 回归测试：python3 -m unittest discover -s src/geoclaw_qgis/tests。</w:t>
+      </w:r>
+    </w:p>
+    <w:p>
+      <w:r>
+        <w:t xml:space="preserve">6.10 复杂端到端测试：bash scripts/e2e_complex_nl_suite.sh。</w:t>
       </w:r>
     </w:p>
     <w:p>
@@ -362,7 +367,7 @@
     </w:p>
     <w:p>
       <w:r>
-        <w:t xml:space="preserve">当前版本：v3.0.0</w:t>
+        <w:t xml:space="preserve">当前版本：v3.1.0</w:t>
       </w:r>
     </w:p>
     <w:p>

</xml_diff>

<commit_message>
release: v3.1.1 onboarding/chat e2e and docs sync
</commit_message>
<xml_diff>
--- a/GeoClaw-OpenAI_工程说明书.docx
+++ b/GeoClaw-OpenAI_工程说明书.docx
@@ -20,12 +20,12 @@
     </w:p>
     <w:p>
       <w:r>
-        <w:t xml:space="preserve">版本：v3.1.0</w:t>
-      </w:r>
-    </w:p>
-    <w:p>
-      <w:r>
-        <w:t xml:space="preserve">发布日期：2026-03-08</w:t>
+        <w:t xml:space="preserve">版本：v3.1.1</w:t>
+      </w:r>
+    </w:p>
+    <w:p>
+      <w:r>
+        <w:t xml:space="preserve">发布日期：2026-03-09</w:t>
       </w:r>
     </w:p>
     <w:p>
@@ -53,7 +53,7 @@
     </w:p>
     <w:p>
       <w:r>
-        <w:t xml:space="preserve">v3.1.0 在 SRE+NL+Skill+Memory 稳定闭环基础上，新增本地大模型与 profile 对话演化机制。</w:t>
+        <w:t xml:space="preserve">v3.1.1 在 SRE+NL+Skill+Memory 稳定闭环基础上，新增本地大模型与 profile 对话演化机制。</w:t>
       </w:r>
     </w:p>
     <w:p>
@@ -71,7 +71,7 @@
     </w:p>
     <w:p>
       <w:r>
-        <w:t xml:space="preserve">版本：3.1.0</w:t>
+        <w:t xml:space="preserve">版本：3.1.1</w:t>
       </w:r>
     </w:p>
     <w:p>
@@ -190,42 +190,42 @@
         <w:pStyle w:val="Heading1"/>
       </w:pPr>
       <w:r>
-        <w:t xml:space="preserve">5. 3.1.0 版本新增重点</w:t>
-      </w:r>
-    </w:p>
-    <w:p>
-      <w:r>
-        <w:t xml:space="preserve">5.1 新增 Ollama 本地大模型 provider，并接入 onboard/config set 全链路。</w:t>
-      </w:r>
-    </w:p>
-    <w:p>
-      <w:r>
-        <w:t xml:space="preserve">5.2 新增 profile evolve：支持根据对话摘要更新 user.md/soul.md 覆盖层。</w:t>
-      </w:r>
-    </w:p>
-    <w:p>
-      <w:r>
-        <w:t xml:space="preserve">5.3 soul 安全边界字段锁定：重要安全与执行约束不可通过对话改写。</w:t>
-      </w:r>
-    </w:p>
-    <w:p>
-      <w:r>
-        <w:t xml:space="preserve">5.4 新增 NL-&gt;profile 路由能力：自然语言可触发 profile 演化命令。</w:t>
-      </w:r>
-    </w:p>
-    <w:p>
-      <w:r>
-        <w:t xml:space="preserve">5.5 day-run 与单元测试矩阵扩展，覆盖 profile evolve 与 provider 兼容性。</w:t>
-      </w:r>
-    </w:p>
-    <w:p>
-      <w:r>
-        <w:t xml:space="preserve">5.6 data 目录持续跟踪，支持新用户直接复现实验样例。</w:t>
-      </w:r>
-    </w:p>
-    <w:p>
-      <w:r>
-        <w:t xml:space="preserve">5.7 版本与文档体系升级到 v3.1.0。</w:t>
+        <w:t xml:space="preserve">5. 3.1.1 版本新增重点</w:t>
+      </w:r>
+    </w:p>
+    <w:p>
+      <w:r>
+        <w:t xml:space="preserve">5.1 onboard API Key 交互改为可见输入；重配时显示脱敏 key 片段（开头/结尾）。</w:t>
+      </w:r>
+    </w:p>
+    <w:p>
+      <w:r>
+        <w:t xml:space="preserve">5.2 新增 chat --execute：可执行请求自动委派至 nl --execute，并支持 SRE 报告输出。</w:t>
+      </w:r>
+    </w:p>
+    <w:p>
+      <w:r>
+        <w:t xml:space="preserve">5.3 修复显式数据源路由：非武汉 city/bbox/data-dir 请求保持 native run，不被误改写。</w:t>
+      </w:r>
+    </w:p>
+    <w:p>
+      <w:r>
+        <w:t xml:space="preserve">5.4 chat 回退回复消费 soul/user 偏好（语言、语气、使命）并输出建议步骤。</w:t>
+      </w:r>
+    </w:p>
+    <w:p>
+      <w:r>
+        <w:t xml:space="preserve">5.5 新增景德镇聊天端到端案例（聊天过程 + 推理报告 + Top5 结果）供新手复现。</w:t>
+      </w:r>
+    </w:p>
+    <w:p>
+      <w:r>
+        <w:t xml:space="preserve">5.6 测试矩阵增强：覆盖 chat/local/parser/NL 路由与 key 脱敏行为。</w:t>
+      </w:r>
+    </w:p>
+    <w:p>
+      <w:r>
+        <w:t xml:space="preserve">5.7 版本与文档体系升级到 v3.1.1，并在 README 增加沙盒安全声明。</w:t>
       </w:r>
     </w:p>
     <w:p>
@@ -287,6 +287,11 @@
       </w:r>
     </w:p>
     <w:p>
+      <w:r>
+        <w:t xml:space="preserve">6.11 聊天端到端样例：geoclaw-openai chat --message "请你下载景德镇的数据，并分析最适合建设商场的前5个地址，输出报告" --no-ai --execute。</w:t>
+      </w:r>
+    </w:p>
+    <w:p>
       <w:pPr>
         <w:pStyle w:val="Heading1"/>
       </w:pPr>
@@ -362,12 +367,12 @@
     </w:p>
     <w:p>
       <w:r>
-        <w:t xml:space="preserve">文档生成日期：2026-03-08</w:t>
-      </w:r>
-    </w:p>
-    <w:p>
-      <w:r>
-        <w:t xml:space="preserve">当前版本：v3.1.0</w:t>
+        <w:t xml:space="preserve">文档生成日期：2026-03-09</w:t>
+      </w:r>
+    </w:p>
+    <w:p>
+      <w:r>
+        <w:t xml:space="preserve">当前版本：v3.1.1</w:t>
       </w:r>
     </w:p>
     <w:p>

</xml_diff>

<commit_message>
release: bump to v3.1.2 with analysis skill quickstart and docs/manual refresh
</commit_message>
<xml_diff>
--- a/GeoClaw-OpenAI_工程说明书.docx
+++ b/GeoClaw-OpenAI_工程说明书.docx
@@ -20,7 +20,7 @@
     </w:p>
     <w:p>
       <w:r>
-        <w:t xml:space="preserve">版本：v3.1.1</w:t>
+        <w:t xml:space="preserve">版本：v3.1.2</w:t>
       </w:r>
     </w:p>
     <w:p>
@@ -53,7 +53,7 @@
     </w:p>
     <w:p>
       <w:r>
-        <w:t xml:space="preserve">v3.1.1 在 SRE+NL+Skill+Memory 稳定闭环基础上，新增本地大模型与 profile 对话演化机制。</w:t>
+        <w:t xml:space="preserve">v3.1.2 在 SRE+NL+Skill+Memory 稳定闭环基础上，补充可直接用分析 Skill 文档与示例。</w:t>
       </w:r>
     </w:p>
     <w:p>
@@ -71,7 +71,7 @@
     </w:p>
     <w:p>
       <w:r>
-        <w:t xml:space="preserve">版本：3.1.1</w:t>
+        <w:t xml:space="preserve">版本：3.1.2</w:t>
       </w:r>
     </w:p>
     <w:p>
@@ -190,7 +190,7 @@
         <w:pStyle w:val="Heading1"/>
       </w:pPr>
       <w:r>
-        <w:t xml:space="preserve">5. 3.1.1 版本新增重点</w:t>
+        <w:t xml:space="preserve">5. 3.1.2 版本新增重点</w:t>
       </w:r>
     </w:p>
     <w:p>
@@ -225,7 +225,12 @@
     </w:p>
     <w:p>
       <w:r>
-        <w:t xml:space="preserve">5.7 版本与文档体系升级到 v3.1.1，并在 README 增加沙盒安全声明。</w:t>
+        <w:t xml:space="preserve">5.7 新增可直接用分析 Skill 快速上手文档，并加入 README 快速入口。</w:t>
+      </w:r>
+    </w:p>
+    <w:p>
+      <w:r>
+        <w:t xml:space="preserve">5.8 版本与文档体系升级到 v3.1.2，并在 README 持续维护新手入口。</w:t>
       </w:r>
     </w:p>
     <w:p>
@@ -372,7 +377,7 @@
     </w:p>
     <w:p>
       <w:r>
-        <w:t xml:space="preserve">当前版本：v3.1.1</w:t>
+        <w:t xml:space="preserve">当前版本：v3.1.2</w:t>
       </w:r>
     </w:p>
     <w:p>

</xml_diff>

<commit_message>
release: v3.1.3 add openclaw skill import and docs/manual sync
</commit_message>
<xml_diff>
--- a/GeoClaw-OpenAI_工程说明书.docx
+++ b/GeoClaw-OpenAI_工程说明书.docx
@@ -20,12 +20,12 @@
     </w:p>
     <w:p>
       <w:r>
-        <w:t xml:space="preserve">版本：v3.1.2</w:t>
-      </w:r>
-    </w:p>
-    <w:p>
-      <w:r>
-        <w:t xml:space="preserve">发布日期：2026-03-09</w:t>
+        <w:t xml:space="preserve">版本：v3.1.3</w:t>
+      </w:r>
+    </w:p>
+    <w:p>
+      <w:r>
+        <w:t xml:space="preserve">发布日期：2026-03-10</w:t>
       </w:r>
     </w:p>
     <w:p>
@@ -53,7 +53,7 @@
     </w:p>
     <w:p>
       <w:r>
-        <w:t xml:space="preserve">v3.1.2 在 SRE+NL+Skill+Memory 稳定闭环基础上，补充可直接用分析 Skill 文档与示例。</w:t>
+        <w:t xml:space="preserve">v3.1.3 在 SRE+NL+Skill+Memory 稳定闭环基础上，新增 OpenClaw Skill 兼容导入能力。</w:t>
       </w:r>
     </w:p>
     <w:p>
@@ -71,7 +71,7 @@
     </w:p>
     <w:p>
       <w:r>
-        <w:t xml:space="preserve">版本：3.1.2</w:t>
+        <w:t xml:space="preserve">版本：3.1.3</w:t>
       </w:r>
     </w:p>
     <w:p>
@@ -190,47 +190,37 @@
         <w:pStyle w:val="Heading1"/>
       </w:pPr>
       <w:r>
-        <w:t xml:space="preserve">5. 3.1.2 版本新增重点</w:t>
-      </w:r>
-    </w:p>
-    <w:p>
-      <w:r>
-        <w:t xml:space="preserve">5.1 onboard API Key 交互改为可见输入；重配时显示脱敏 key 片段（开头/结尾）。</w:t>
-      </w:r>
-    </w:p>
-    <w:p>
-      <w:r>
-        <w:t xml:space="preserve">5.2 新增 chat --execute：可执行请求自动委派至 nl --execute，并支持 SRE 报告输出。</w:t>
-      </w:r>
-    </w:p>
-    <w:p>
-      <w:r>
-        <w:t xml:space="preserve">5.3 修复显式数据源路由：非武汉 city/bbox/data-dir 请求保持 native run，不被误改写。</w:t>
-      </w:r>
-    </w:p>
-    <w:p>
-      <w:r>
-        <w:t xml:space="preserve">5.4 chat 回退回复消费 soul/user 偏好（语言、语气、使命）并输出建议步骤。</w:t>
-      </w:r>
-    </w:p>
-    <w:p>
-      <w:r>
-        <w:t xml:space="preserve">5.5 新增景德镇聊天端到端案例（聊天过程 + 推理报告 + Top5 结果）供新手复现。</w:t>
-      </w:r>
-    </w:p>
-    <w:p>
-      <w:r>
-        <w:t xml:space="preserve">5.6 测试矩阵增强：覆盖 chat/local/parser/NL 路由与 key 脱敏行为。</w:t>
-      </w:r>
-    </w:p>
-    <w:p>
-      <w:r>
-        <w:t xml:space="preserve">5.7 新增可直接用分析 Skill 快速上手文档，并加入 README 快速入口。</w:t>
-      </w:r>
-    </w:p>
-    <w:p>
-      <w:r>
-        <w:t xml:space="preserve">5.8 版本与文档体系升级到 v3.1.2，并在 README 持续维护新手入口。</w:t>
+        <w:t xml:space="preserve">5. 3.1.3 版本新增重点</w:t>
+      </w:r>
+    </w:p>
+    <w:p>
+      <w:r>
+        <w:t xml:space="preserve">5.1 新增 skill-registry import-openclaw，用于导入 OpenClaw 风格 JSON/YAML skill 描述。</w:t>
+      </w:r>
+    </w:p>
+    <w:p>
+      <w:r>
+        <w:t xml:space="preserve">5.2 OpenClaw 描述可自动映射为 GeoClaw pipeline/ai/builtin 三类 skill。</w:t>
+      </w:r>
+    </w:p>
+    <w:p>
+      <w:r>
+        <w:t xml:space="preserve">5.3 导入流程复用安全评估与确认注册机制，high 风险默认阻断。</w:t>
+      </w:r>
+    </w:p>
+    <w:p>
+      <w:r>
+        <w:t xml:space="preserve">5.4 新增 OpenClaw 适配器与对应单元测试，覆盖转换与 dry-run 注册链路。</w:t>
+      </w:r>
+    </w:p>
+    <w:p>
+      <w:r>
+        <w:t xml:space="preserve">5.5 README/Skill 快速上手/规范文档补充 OpenClaw 接入示例。</w:t>
+      </w:r>
+    </w:p>
+    <w:p>
+      <w:r>
+        <w:t xml:space="preserve">5.6 包版本与运行时版本升级到 v3.1.3。</w:t>
       </w:r>
     </w:p>
     <w:p>
@@ -372,12 +362,12 @@
     </w:p>
     <w:p>
       <w:r>
-        <w:t xml:space="preserve">文档生成日期：2026-03-09</w:t>
-      </w:r>
-    </w:p>
-    <w:p>
-      <w:r>
-        <w:t xml:space="preserve">当前版本：v3.1.2</w:t>
+        <w:t xml:space="preserve">文档生成日期：2026-03-10</w:t>
+      </w:r>
+    </w:p>
+    <w:p>
+      <w:r>
+        <w:t xml:space="preserve">当前版本：v3.1.3</w:t>
       </w:r>
     </w:p>
     <w:p>

</xml_diff>

<commit_message>
release: v3.2.0 chat profile hot-reload and docs
</commit_message>
<xml_diff>
--- a/GeoClaw-OpenAI_工程说明书.docx
+++ b/GeoClaw-OpenAI_工程说明书.docx
@@ -20,7 +20,7 @@
     </w:p>
     <w:p>
       <w:r>
-        <w:t xml:space="preserve">版本：v3.1.3</w:t>
+        <w:t xml:space="preserve">版本：v3.2.0</w:t>
       </w:r>
     </w:p>
     <w:p>
@@ -53,7 +53,7 @@
     </w:p>
     <w:p>
       <w:r>
-        <w:t xml:space="preserve">v3.1.3 在 SRE+NL+Skill+Memory 稳定闭环基础上，新增 OpenClaw Skill 兼容导入能力。</w:t>
+        <w:t xml:space="preserve">v3.2.0 在 SRE+NL+Skill+Memory 稳定闭环基础上，新增 OpenClaw Skill 兼容导入能力。</w:t>
       </w:r>
     </w:p>
     <w:p>
@@ -71,7 +71,7 @@
     </w:p>
     <w:p>
       <w:r>
-        <w:t xml:space="preserve">版本：3.1.3</w:t>
+        <w:t xml:space="preserve">版本：3.2.0</w:t>
       </w:r>
     </w:p>
     <w:p>
@@ -190,7 +190,7 @@
         <w:pStyle w:val="Heading1"/>
       </w:pPr>
       <w:r>
-        <w:t xml:space="preserve">5. 3.1.3 版本新增重点</w:t>
+        <w:t xml:space="preserve">5. 3.2.0 版本新增重点</w:t>
       </w:r>
     </w:p>
     <w:p>
@@ -215,12 +215,22 @@
     </w:p>
     <w:p>
       <w:r>
-        <w:t xml:space="preserve">5.5 README/Skill 快速上手/规范文档补充 OpenClaw 接入示例。</w:t>
-      </w:r>
-    </w:p>
-    <w:p>
-      <w:r>
-        <w:t xml:space="preserve">5.6 包版本与运行时版本升级到 v3.1.3。</w:t>
+        <w:t xml:space="preserve">5.5 新增连续聊天模式（chat --interactive + session-id），支持多轮上下文会话。</w:t>
+      </w:r>
+    </w:p>
+    <w:p>
+      <w:r>
+        <w:t xml:space="preserve">5.6 Chat 命中 profile 意图可直接更新 user.md/soul.md，并在当前会话热加载生效。</w:t>
+      </w:r>
+    </w:p>
+    <w:p>
+      <w:r>
+        <w:t xml:space="preserve">5.7 README/Skill 快速上手/规范文档补充 OpenClaw 接入与连续聊天示例。</w:t>
+      </w:r>
+    </w:p>
+    <w:p>
+      <w:r>
+        <w:t xml:space="preserve">5.8 包版本与运行时版本升级到 v3.2.0。</w:t>
       </w:r>
     </w:p>
     <w:p>
@@ -287,6 +297,11 @@
       </w:r>
     </w:p>
     <w:p>
+      <w:r>
+        <w:t xml:space="preserve">6.12 连续聊天样例：geoclaw-openai chat --interactive --session-id demo_chat。</w:t>
+      </w:r>
+    </w:p>
+    <w:p>
       <w:pPr>
         <w:pStyle w:val="Heading1"/>
       </w:pPr>
@@ -367,7 +382,7 @@
     </w:p>
     <w:p>
       <w:r>
-        <w:t xml:space="preserve">当前版本：v3.1.3</w:t>
+        <w:t xml:space="preserve">当前版本：v3.2.0</w:t>
       </w:r>
     </w:p>
     <w:p>

</xml_diff>